<commit_message>
Fill in Nivo sizes on women's pant size chart
Co-Authored-By: Claude Opus 5.5 <noreply@anthropic.com>
Claude-Session: https://claude.ai/code/session_01JDwQw7JjDqKz2VPXW7wT25
</commit_message>
<xml_diff>
--- a/size-charts/womens-pant-size-chart.docx
+++ b/size-charts/womens-pant-size-chart.docx
@@ -531,6 +531,7 @@
                 <w:color w:val="1F2A44"/>
                 <w:sz w:val="30"/>
               </w:rPr>
+              <w:t>XS</w:t>
             </w:r>
           </w:p>
         </w:tc>
@@ -728,6 +729,7 @@
                 <w:color w:val="1F2A44"/>
                 <w:sz w:val="30"/>
               </w:rPr>
+              <w:t>S</w:t>
             </w:r>
           </w:p>
         </w:tc>
@@ -925,6 +927,7 @@
                 <w:color w:val="1F2A44"/>
                 <w:sz w:val="30"/>
               </w:rPr>
+              <w:t>M</w:t>
             </w:r>
           </w:p>
         </w:tc>
@@ -1122,6 +1125,7 @@
                 <w:color w:val="1F2A44"/>
                 <w:sz w:val="30"/>
               </w:rPr>
+              <w:t>M</w:t>
             </w:r>
           </w:p>
         </w:tc>
@@ -1319,6 +1323,7 @@
                 <w:color w:val="1F2A44"/>
                 <w:sz w:val="30"/>
               </w:rPr>
+              <w:t>L</w:t>
             </w:r>
           </w:p>
         </w:tc>
@@ -1516,6 +1521,7 @@
                 <w:color w:val="1F2A44"/>
                 <w:sz w:val="30"/>
               </w:rPr>
+              <w:t>XL</w:t>
             </w:r>
           </w:p>
         </w:tc>
@@ -1713,6 +1719,7 @@
                 <w:color w:val="1F2A44"/>
                 <w:sz w:val="30"/>
               </w:rPr>
+              <w:t>XL</w:t>
             </w:r>
           </w:p>
         </w:tc>

</xml_diff>

<commit_message>
Update Röhnisch column to brand's size conversion (letter + EU)
Co-Authored-By: Claude Opus 5.5 <noreply@anthropic.com>
Claude-Session: https://claude.ai/code/session_01JDwQw7JjDqKz2VPXW7wT25
</commit_message>
<xml_diff>
--- a/size-charts/womens-pant-size-chart.docx
+++ b/size-charts/womens-pant-size-chart.docx
@@ -673,7 +673,7 @@
                 <w:color w:val="1F2A44"/>
                 <w:sz w:val="30"/>
               </w:rPr>
-              <w:t>34</w:t>
+              <w:t>XS · 34</w:t>
             </w:r>
           </w:p>
         </w:tc>
@@ -871,7 +871,7 @@
                 <w:color w:val="1F2A44"/>
                 <w:sz w:val="30"/>
               </w:rPr>
-              <w:t>36</w:t>
+              <w:t>XS · 36</w:t>
             </w:r>
           </w:p>
         </w:tc>
@@ -1069,7 +1069,7 @@
                 <w:color w:val="1F2A44"/>
                 <w:sz w:val="30"/>
               </w:rPr>
-              <w:t>38</w:t>
+              <w:t>S · 38</w:t>
             </w:r>
           </w:p>
         </w:tc>
@@ -1267,7 +1267,7 @@
                 <w:color w:val="1F2A44"/>
                 <w:sz w:val="30"/>
               </w:rPr>
-              <w:t>40</w:t>
+              <w:t>M · 40</w:t>
             </w:r>
           </w:p>
         </w:tc>
@@ -1465,7 +1465,7 @@
                 <w:color w:val="1F2A44"/>
                 <w:sz w:val="30"/>
               </w:rPr>
-              <w:t>42</w:t>
+              <w:t>M · 42</w:t>
             </w:r>
           </w:p>
         </w:tc>
@@ -1663,7 +1663,7 @@
                 <w:color w:val="1F2A44"/>
                 <w:sz w:val="30"/>
               </w:rPr>
-              <w:t>44</w:t>
+              <w:t>L · 44</w:t>
             </w:r>
           </w:p>
         </w:tc>

</xml_diff>

<commit_message>
Show EU sizes only in Röhnisch column
Co-Authored-By: Claude Opus 5.5 <noreply@anthropic.com>
Claude-Session: https://claude.ai/code/session_01JDwQw7JjDqKz2VPXW7wT25
</commit_message>
<xml_diff>
--- a/size-charts/womens-pant-size-chart.docx
+++ b/size-charts/womens-pant-size-chart.docx
@@ -673,7 +673,7 @@
                 <w:color w:val="1F2A44"/>
                 <w:sz w:val="30"/>
               </w:rPr>
-              <w:t>XS · 34</w:t>
+              <w:t>34</w:t>
             </w:r>
           </w:p>
         </w:tc>
@@ -871,7 +871,7 @@
                 <w:color w:val="1F2A44"/>
                 <w:sz w:val="30"/>
               </w:rPr>
-              <w:t>XS · 36</w:t>
+              <w:t>36</w:t>
             </w:r>
           </w:p>
         </w:tc>
@@ -1069,7 +1069,7 @@
                 <w:color w:val="1F2A44"/>
                 <w:sz w:val="30"/>
               </w:rPr>
-              <w:t>S · 38</w:t>
+              <w:t>38</w:t>
             </w:r>
           </w:p>
         </w:tc>
@@ -1267,7 +1267,7 @@
                 <w:color w:val="1F2A44"/>
                 <w:sz w:val="30"/>
               </w:rPr>
-              <w:t>M · 40</w:t>
+              <w:t>40</w:t>
             </w:r>
           </w:p>
         </w:tc>
@@ -1465,7 +1465,7 @@
                 <w:color w:val="1F2A44"/>
                 <w:sz w:val="30"/>
               </w:rPr>
-              <w:t>M · 42</w:t>
+              <w:t>42</w:t>
             </w:r>
           </w:p>
         </w:tc>
@@ -1663,7 +1663,7 @@
                 <w:color w:val="1F2A44"/>
                 <w:sz w:val="30"/>
               </w:rPr>
-              <w:t>L · 44</w:t>
+              <w:t>44</w:t>
             </w:r>
           </w:p>
         </w:tc>

</xml_diff>